<commit_message>
docs(seminarski): podaci studenta na naslovnoj strani i naziv rada po konvenciji
</commit_message>
<xml_diff>
--- a/reports/Seminarski_rad.docx
+++ b/reports/Seminarski_rad.docx
@@ -90,7 +90,7 @@
           <w:sz w:val="26"/>
           <w:szCs w:val="26"/>
         </w:rPr>
-        <w:t xml:space="preserve">Student: [IME I PREZIME]</w:t>
+        <w:t xml:space="preserve">Student: Đorđe Dragović</w:t>
       </w:r>
     </w:p>
     <w:p>
@@ -103,7 +103,7 @@
           <w:sz w:val="26"/>
           <w:szCs w:val="26"/>
         </w:rPr>
-        <w:t xml:space="preserve">Broj indeksa: [BROJ INDEKSA]</w:t>
+        <w:t xml:space="preserve">Broj indeksa: 582/2024</w:t>
       </w:r>
     </w:p>
     <w:p>

</xml_diff>